<commit_message>
Remove AI and payment integrations from documentation and deployment flow
Removes all references to OpenAI and PayPal from the project's documentation, deployment scripts, and visual diagrams, updating the technology stack and external service integrations accordingly.

Replit-Commit-Author: Agent
Replit-Commit-Session-Id: 6d2574e3-cf59-4195-8e61-d725d2127375
Replit-Commit-Checkpoint-Type: full_checkpoint
Replit-Commit-Event-Id: 441d5666-7486-41ba-8a68-33edab6863f7
Replit-Helium-Checkpoint-Created: true
</commit_message>
<xml_diff>
--- a/FridayReportAI_Azure_Container_App_Deployment_Guide.docx
+++ b/FridayReportAI_Azure_Container_App_Deployment_Guide.docx
@@ -613,7 +613,7 @@
           <w:sz w:val="22"/>
           <w:szCs w:val="22"/>
         </w:rPr>
-        <w:t xml:space="preserve">FridayReport.AI is an enterprise-grade Project &amp; Portfolio Management (PPM) platform built on a modern TypeScript stack. The application uses a React 18 frontend with Tailwind CSS, an Express.js backend with PostgreSQL via Drizzle ORM, and integrates with OpenAI for AI-driven risk assessments, Microsoft Graph for Planner/Dataverse connectivity, and PayPal for subscription billing.</w:t>
+        <w:t xml:space="preserve">FridayReport.AI is an enterprise-grade Project &amp; Portfolio Management (PPM) platform built on a modern TypeScript stack. The application uses a React 18 frontend with Tailwind CSS, an Express.js backend with PostgreSQL via Drizzle ORM, and integrates with Microsoft Graph for Planner/Dataverse connectivity.</w:t>
       </w:r>
     </w:p>
     <w:p>
@@ -917,7 +917,7 @@
                 <w:sz w:val="20"/>
                 <w:szCs w:val="20"/>
               </w:rPr>
-              <w:t xml:space="preserve">AI Services</w:t>
+              <w:t xml:space="preserve">File Processing</w:t>
             </w:r>
           </w:p>
         </w:tc>
@@ -936,7 +936,7 @@
                 <w:sz w:val="20"/>
                 <w:szCs w:val="20"/>
               </w:rPr>
-              <w:t xml:space="preserve">OpenAI API (GPT-4o) for risk assessment, dashboard generation, resource optimization</w:t>
+              <w:t xml:space="preserve">Java-based MPP parser (MPXJ library) for Microsoft Project files</w:t>
             </w:r>
           </w:p>
         </w:tc>
@@ -954,51 +954,11 @@
                 <w:sz w:val="20"/>
                 <w:szCs w:val="20"/>
               </w:rPr>
-              <w:t xml:space="preserve">File Processing</w:t>
-            </w:r>
-          </w:p>
-        </w:tc>
-        <w:tc>
-          <w:p>
-            <w:pPr>
-              <w:spacing w:after="40" w:before="40"/>
-            </w:pPr>
-            <w:r>
-              <w:rPr>
-                <w:rFonts w:ascii="Calibri" w:cs="Calibri" w:eastAsia="Calibri" w:hAnsi="Calibri"/>
-                <w:color w:val="333333"/>
-                <w:sz w:val="20"/>
-                <w:szCs w:val="20"/>
-              </w:rPr>
-              <w:t xml:space="preserve">Java-based MPP parser (MPXJ library) for Microsoft Project files</w:t>
-            </w:r>
-          </w:p>
-        </w:tc>
-      </w:tr>
-      <w:tr>
-        <w:tc>
-          <w:tcPr>
-            <w:shd w:fill="F2F4F7" w:color="F2F4F7" w:val="solid"/>
-          </w:tcPr>
-          <w:p>
-            <w:pPr>
-              <w:spacing w:after="40" w:before="40"/>
-            </w:pPr>
-            <w:r>
-              <w:rPr>
-                <w:rFonts w:ascii="Calibri" w:cs="Calibri" w:eastAsia="Calibri" w:hAnsi="Calibri"/>
-                <w:color w:val="333333"/>
-                <w:sz w:val="20"/>
-                <w:szCs w:val="20"/>
-              </w:rPr>
               <w:t xml:space="preserve">Email</w:t>
             </w:r>
           </w:p>
         </w:tc>
         <w:tc>
-          <w:tcPr>
-            <w:shd w:fill="F2F4F7" w:color="F2F4F7" w:val="solid"/>
-          </w:tcPr>
           <w:p>
             <w:pPr>
               <w:spacing w:after="40" w:before="40"/>
@@ -1011,40 +971,6 @@
                 <w:szCs w:val="20"/>
               </w:rPr>
               <w:t xml:space="preserve">Resend API for transactional emails</w:t>
-            </w:r>
-          </w:p>
-        </w:tc>
-      </w:tr>
-      <w:tr>
-        <w:tc>
-          <w:p>
-            <w:pPr>
-              <w:spacing w:after="40" w:before="40"/>
-            </w:pPr>
-            <w:r>
-              <w:rPr>
-                <w:rFonts w:ascii="Calibri" w:cs="Calibri" w:eastAsia="Calibri" w:hAnsi="Calibri"/>
-                <w:color w:val="333333"/>
-                <w:sz w:val="20"/>
-                <w:szCs w:val="20"/>
-              </w:rPr>
-              <w:t xml:space="preserve">Payments</w:t>
-            </w:r>
-          </w:p>
-        </w:tc>
-        <w:tc>
-          <w:p>
-            <w:pPr>
-              <w:spacing w:after="40" w:before="40"/>
-            </w:pPr>
-            <w:r>
-              <w:rPr>
-                <w:rFonts w:ascii="Calibri" w:cs="Calibri" w:eastAsia="Calibri" w:hAnsi="Calibri"/>
-                <w:color w:val="333333"/>
-                <w:sz w:val="20"/>
-                <w:szCs w:val="20"/>
-              </w:rPr>
-              <w:t xml:space="preserve">PayPal REST API for subscription billing</w:t>
             </w:r>
           </w:p>
         </w:tc>
@@ -1461,7 +1387,7 @@
                 <w:sz w:val="20"/>
                 <w:szCs w:val="20"/>
               </w:rPr>
-              <w:t xml:space="preserve">Business logic and third-party integrations (Microsoft Graph, OpenAI, email)</w:t>
+              <w:t xml:space="preserve">Business logic and third-party integrations (Microsoft Graph, email)</w:t>
             </w:r>
           </w:p>
         </w:tc>
@@ -2325,7 +2251,7 @@
           <w:sz w:val="22"/>
           <w:szCs w:val="22"/>
         </w:rPr>
-        <w:t xml:space="preserve">Outbound API calls go to OpenAI, Resend, Google (OAuth), Microsoft Graph, and PayPal.</w:t>
+        <w:t xml:space="preserve">Outbound API calls go to Resend, Google (OAuth), and Microsoft Graph.</w:t>
       </w:r>
     </w:p>
     <w:p>
@@ -4403,38 +4329,6 @@
       </w:r>
     </w:p>
     <w:p>
-      <w:pPr>
-        <w:shd w:fill="F2F4F7" w:color="F2F4F7" w:val="solid"/>
-        <w:spacing w:after="40" w:before="40"/>
-        <w:ind w:left="288" w:right="288"/>
-      </w:pPr>
-      <w:r>
-        <w:rPr>
-          <w:rFonts w:ascii="Consolas" w:cs="Consolas" w:eastAsia="Consolas" w:hAnsi="Consolas"/>
-          <w:color w:val="17255A"/>
-          <w:sz w:val="18"/>
-          <w:szCs w:val="18"/>
-        </w:rPr>
-        <w:t xml:space="preserve">az keyvault secret set --vault-name fridayreport-kv --name AI-INTEGRATIONS-OPENAI-API-KEY \</w:t>
-      </w:r>
-    </w:p>
-    <w:p>
-      <w:pPr>
-        <w:shd w:fill="F2F4F7" w:color="F2F4F7" w:val="solid"/>
-        <w:spacing w:after="40" w:before="40"/>
-        <w:ind w:left="288" w:right="288"/>
-      </w:pPr>
-      <w:r>
-        <w:rPr>
-          <w:rFonts w:ascii="Consolas" w:cs="Consolas" w:eastAsia="Consolas" w:hAnsi="Consolas"/>
-          <w:color w:val="17255A"/>
-          <w:sz w:val="18"/>
-          <w:szCs w:val="18"/>
-        </w:rPr>
-        <w:t xml:space="preserve">  --value "&lt;your-openai-api-key&gt;"</w:t>
-      </w:r>
-    </w:p>
-    <w:p>
       <w:r>
         <w:br w:type="page"/>
       </w:r>
@@ -5088,22 +4982,6 @@
           <w:sz w:val="18"/>
           <w:szCs w:val="18"/>
         </w:rPr>
-        <w:t xml:space="preserve">    ai-integrations-openai-api-key="&lt;your-openai-key&gt;" \</w:t>
-      </w:r>
-    </w:p>
-    <w:p>
-      <w:pPr>
-        <w:shd w:fill="F2F4F7" w:color="F2F4F7" w:val="solid"/>
-        <w:spacing w:after="40" w:before="40"/>
-        <w:ind w:left="288" w:right="288"/>
-      </w:pPr>
-      <w:r>
-        <w:rPr>
-          <w:rFonts w:ascii="Consolas" w:cs="Consolas" w:eastAsia="Consolas" w:hAnsi="Consolas"/>
-          <w:color w:val="17255A"/>
-          <w:sz w:val="18"/>
-          <w:szCs w:val="18"/>
-        </w:rPr>
         <w:t xml:space="preserve">    google-client-id="&lt;your-google-client-id&gt;" \</w:t>
       </w:r>
     </w:p>
@@ -5168,38 +5046,6 @@
           <w:sz w:val="18"/>
           <w:szCs w:val="18"/>
         </w:rPr>
-        <w:t xml:space="preserve">    paypal-client-id="&lt;your-paypal-client-id&gt;" \</w:t>
-      </w:r>
-    </w:p>
-    <w:p>
-      <w:pPr>
-        <w:shd w:fill="F2F4F7" w:color="F2F4F7" w:val="solid"/>
-        <w:spacing w:after="40" w:before="40"/>
-        <w:ind w:left="288" w:right="288"/>
-      </w:pPr>
-      <w:r>
-        <w:rPr>
-          <w:rFonts w:ascii="Consolas" w:cs="Consolas" w:eastAsia="Consolas" w:hAnsi="Consolas"/>
-          <w:color w:val="17255A"/>
-          <w:sz w:val="18"/>
-          <w:szCs w:val="18"/>
-        </w:rPr>
-        <w:t xml:space="preserve">    paypal-client-secret="&lt;your-paypal-client-secret&gt;" \</w:t>
-      </w:r>
-    </w:p>
-    <w:p>
-      <w:pPr>
-        <w:shd w:fill="F2F4F7" w:color="F2F4F7" w:val="solid"/>
-        <w:spacing w:after="40" w:before="40"/>
-        <w:ind w:left="288" w:right="288"/>
-      </w:pPr>
-      <w:r>
-        <w:rPr>
-          <w:rFonts w:ascii="Consolas" w:cs="Consolas" w:eastAsia="Consolas" w:hAnsi="Consolas"/>
-          <w:color w:val="17255A"/>
-          <w:sz w:val="18"/>
-          <w:szCs w:val="18"/>
-        </w:rPr>
         <w:t xml:space="preserve">    resend-api-key="&lt;your-resend-api-key&gt;" \</w:t>
       </w:r>
     </w:p>
@@ -5296,22 +5142,6 @@
           <w:sz w:val="18"/>
           <w:szCs w:val="18"/>
         </w:rPr>
-        <w:t xml:space="preserve">    AI_INTEGRATIONS_OPENAI_API_KEY=secretref:ai-integrations-openai-api-key \</w:t>
-      </w:r>
-    </w:p>
-    <w:p>
-      <w:pPr>
-        <w:shd w:fill="F2F4F7" w:color="F2F4F7" w:val="solid"/>
-        <w:spacing w:after="40" w:before="40"/>
-        <w:ind w:left="288" w:right="288"/>
-      </w:pPr>
-      <w:r>
-        <w:rPr>
-          <w:rFonts w:ascii="Consolas" w:cs="Consolas" w:eastAsia="Consolas" w:hAnsi="Consolas"/>
-          <w:color w:val="17255A"/>
-          <w:sz w:val="18"/>
-          <w:szCs w:val="18"/>
-        </w:rPr>
         <w:t xml:space="preserve">    GOOGLE_CLIENT_ID=secretref:google-client-id \</w:t>
       </w:r>
     </w:p>
@@ -5361,38 +5191,6 @@
           <w:szCs w:val="18"/>
         </w:rPr>
         <w:t xml:space="preserve">    MICROSOFT_CLIENT_SECRET=secretref:microsoft-client-secret \</w:t>
-      </w:r>
-    </w:p>
-    <w:p>
-      <w:pPr>
-        <w:shd w:fill="F2F4F7" w:color="F2F4F7" w:val="solid"/>
-        <w:spacing w:after="40" w:before="40"/>
-        <w:ind w:left="288" w:right="288"/>
-      </w:pPr>
-      <w:r>
-        <w:rPr>
-          <w:rFonts w:ascii="Consolas" w:cs="Consolas" w:eastAsia="Consolas" w:hAnsi="Consolas"/>
-          <w:color w:val="17255A"/>
-          <w:sz w:val="18"/>
-          <w:szCs w:val="18"/>
-        </w:rPr>
-        <w:t xml:space="preserve">    PAYPAL_CLIENT_ID=secretref:paypal-client-id \</w:t>
-      </w:r>
-    </w:p>
-    <w:p>
-      <w:pPr>
-        <w:shd w:fill="F2F4F7" w:color="F2F4F7" w:val="solid"/>
-        <w:spacing w:after="40" w:before="40"/>
-        <w:ind w:left="288" w:right="288"/>
-      </w:pPr>
-      <w:r>
-        <w:rPr>
-          <w:rFonts w:ascii="Consolas" w:cs="Consolas" w:eastAsia="Consolas" w:hAnsi="Consolas"/>
-          <w:color w:val="17255A"/>
-          <w:sz w:val="18"/>
-          <w:szCs w:val="18"/>
-        </w:rPr>
-        <w:t xml:space="preserve">    PAYPAL_CLIENT_SECRET=secretref:paypal-client-secret \</w:t>
       </w:r>
     </w:p>
     <w:p>
@@ -6994,7 +6792,7 @@
           <w:bCs/>
           <w:color w:val="075DD1"/>
         </w:rPr>
-        <w:t xml:space="preserve">5.2 AI Integration</w:t>
+        <w:t xml:space="preserve">5.2 Authentication — Google OAuth</w:t>
       </w:r>
     </w:p>
     <w:tbl>
@@ -7095,7 +6893,7 @@
                 <w:sz w:val="20"/>
                 <w:szCs w:val="20"/>
               </w:rPr>
-              <w:t xml:space="preserve">AI_INTEGRATIONS_OPENAI_API_KEY</w:t>
+              <w:t xml:space="preserve">GOOGLE_CLIENT_ID</w:t>
             </w:r>
           </w:p>
         </w:tc>
@@ -7114,7 +6912,7 @@
                 <w:sz w:val="20"/>
                 <w:szCs w:val="20"/>
               </w:rPr>
-              <w:t xml:space="preserve">OpenAI API key for GPT-4o features</w:t>
+              <w:t xml:space="preserve">Google OAuth 2.0 client ID</w:t>
             </w:r>
           </w:p>
         </w:tc>
@@ -7133,7 +6931,7 @@
                 <w:sz w:val="20"/>
                 <w:szCs w:val="20"/>
               </w:rPr>
-              <w:t xml:space="preserve">sk-... (or Azure OpenAI key)</w:t>
+              <w:t xml:space="preserve">From Google Cloud Console</w:t>
             </w:r>
           </w:p>
         </w:tc>
@@ -7151,39 +6949,39 @@
                 <w:sz w:val="20"/>
                 <w:szCs w:val="20"/>
               </w:rPr>
-              <w:t xml:space="preserve">AI_INTEGRATIONS_OPENAI_BASE_URL</w:t>
-            </w:r>
-          </w:p>
-        </w:tc>
-        <w:tc>
-          <w:p>
-            <w:pPr>
-              <w:spacing w:after="40" w:before="40"/>
-            </w:pPr>
-            <w:r>
-              <w:rPr>
-                <w:rFonts w:ascii="Calibri" w:cs="Calibri" w:eastAsia="Calibri" w:hAnsi="Calibri"/>
-                <w:color w:val="333333"/>
-                <w:sz w:val="20"/>
-                <w:szCs w:val="20"/>
-              </w:rPr>
-              <w:t xml:space="preserve">API base URL (for Azure OpenAI)</w:t>
-            </w:r>
-          </w:p>
-        </w:tc>
-        <w:tc>
-          <w:p>
-            <w:pPr>
-              <w:spacing w:after="40" w:before="40"/>
-            </w:pPr>
-            <w:r>
-              <w:rPr>
-                <w:rFonts w:ascii="Calibri" w:cs="Calibri" w:eastAsia="Calibri" w:hAnsi="Calibri"/>
-                <w:color w:val="333333"/>
-                <w:sz w:val="20"/>
-                <w:szCs w:val="20"/>
-              </w:rPr>
-              <w:t xml:space="preserve">https://&lt;resource&gt;.openai.azure.com/</w:t>
+              <w:t xml:space="preserve">GOOGLE_CLIENT_SECRET</w:t>
+            </w:r>
+          </w:p>
+        </w:tc>
+        <w:tc>
+          <w:p>
+            <w:pPr>
+              <w:spacing w:after="40" w:before="40"/>
+            </w:pPr>
+            <w:r>
+              <w:rPr>
+                <w:rFonts w:ascii="Calibri" w:cs="Calibri" w:eastAsia="Calibri" w:hAnsi="Calibri"/>
+                <w:color w:val="333333"/>
+                <w:sz w:val="20"/>
+                <w:szCs w:val="20"/>
+              </w:rPr>
+              <w:t xml:space="preserve">Google OAuth 2.0 client secret</w:t>
+            </w:r>
+          </w:p>
+        </w:tc>
+        <w:tc>
+          <w:p>
+            <w:pPr>
+              <w:spacing w:after="40" w:before="40"/>
+            </w:pPr>
+            <w:r>
+              <w:rPr>
+                <w:rFonts w:ascii="Calibri" w:cs="Calibri" w:eastAsia="Calibri" w:hAnsi="Calibri"/>
+                <w:color w:val="333333"/>
+                <w:sz w:val="20"/>
+                <w:szCs w:val="20"/>
+              </w:rPr>
+              <w:t xml:space="preserve">From Google Cloud Console</w:t>
             </w:r>
           </w:p>
         </w:tc>
@@ -7206,7 +7004,7 @@
           <w:bCs/>
           <w:color w:val="075DD1"/>
         </w:rPr>
-        <w:t xml:space="preserve">5.3 Authentication — Google OAuth</w:t>
+        <w:t xml:space="preserve">5.3 Authentication — Microsoft Entra ID</w:t>
       </w:r>
     </w:p>
     <w:tbl>
@@ -7307,7 +7105,7 @@
                 <w:sz w:val="20"/>
                 <w:szCs w:val="20"/>
               </w:rPr>
-              <w:t xml:space="preserve">GOOGLE_CLIENT_ID</w:t>
+              <w:t xml:space="preserve">MICROSOFT_CLIENT_ID</w:t>
             </w:r>
           </w:p>
         </w:tc>
@@ -7326,7 +7124,7 @@
                 <w:sz w:val="20"/>
                 <w:szCs w:val="20"/>
               </w:rPr>
-              <w:t xml:space="preserve">Google OAuth 2.0 client ID</w:t>
+              <w:t xml:space="preserve">Entra ID application client ID</w:t>
             </w:r>
           </w:p>
         </w:tc>
@@ -7345,7 +7143,7 @@
                 <w:sz w:val="20"/>
                 <w:szCs w:val="20"/>
               </w:rPr>
-              <w:t xml:space="preserve">From Google Cloud Console</w:t>
+              <w:t xml:space="preserve">From Azure Portal → App Registrations</w:t>
             </w:r>
           </w:p>
         </w:tc>
@@ -7363,39 +7161,39 @@
                 <w:sz w:val="20"/>
                 <w:szCs w:val="20"/>
               </w:rPr>
-              <w:t xml:space="preserve">GOOGLE_CLIENT_SECRET</w:t>
-            </w:r>
-          </w:p>
-        </w:tc>
-        <w:tc>
-          <w:p>
-            <w:pPr>
-              <w:spacing w:after="40" w:before="40"/>
-            </w:pPr>
-            <w:r>
-              <w:rPr>
-                <w:rFonts w:ascii="Calibri" w:cs="Calibri" w:eastAsia="Calibri" w:hAnsi="Calibri"/>
-                <w:color w:val="333333"/>
-                <w:sz w:val="20"/>
-                <w:szCs w:val="20"/>
-              </w:rPr>
-              <w:t xml:space="preserve">Google OAuth 2.0 client secret</w:t>
-            </w:r>
-          </w:p>
-        </w:tc>
-        <w:tc>
-          <w:p>
-            <w:pPr>
-              <w:spacing w:after="40" w:before="40"/>
-            </w:pPr>
-            <w:r>
-              <w:rPr>
-                <w:rFonts w:ascii="Calibri" w:cs="Calibri" w:eastAsia="Calibri" w:hAnsi="Calibri"/>
-                <w:color w:val="333333"/>
-                <w:sz w:val="20"/>
-                <w:szCs w:val="20"/>
-              </w:rPr>
-              <w:t xml:space="preserve">From Google Cloud Console</w:t>
+              <w:t xml:space="preserve">MICROSOFT_CLIENT_SECRET</w:t>
+            </w:r>
+          </w:p>
+        </w:tc>
+        <w:tc>
+          <w:p>
+            <w:pPr>
+              <w:spacing w:after="40" w:before="40"/>
+            </w:pPr>
+            <w:r>
+              <w:rPr>
+                <w:rFonts w:ascii="Calibri" w:cs="Calibri" w:eastAsia="Calibri" w:hAnsi="Calibri"/>
+                <w:color w:val="333333"/>
+                <w:sz w:val="20"/>
+                <w:szCs w:val="20"/>
+              </w:rPr>
+              <w:t xml:space="preserve">Entra ID application client secret</w:t>
+            </w:r>
+          </w:p>
+        </w:tc>
+        <w:tc>
+          <w:p>
+            <w:pPr>
+              <w:spacing w:after="40" w:before="40"/>
+            </w:pPr>
+            <w:r>
+              <w:rPr>
+                <w:rFonts w:ascii="Calibri" w:cs="Calibri" w:eastAsia="Calibri" w:hAnsi="Calibri"/>
+                <w:color w:val="333333"/>
+                <w:sz w:val="20"/>
+                <w:szCs w:val="20"/>
+              </w:rPr>
+              <w:t xml:space="preserve">From Azure Portal → App Registrations</w:t>
             </w:r>
           </w:p>
         </w:tc>
@@ -7418,7 +7216,7 @@
           <w:bCs/>
           <w:color w:val="075DD1"/>
         </w:rPr>
-        <w:t xml:space="preserve">5.4 Authentication — Microsoft Entra ID</w:t>
+        <w:t xml:space="preserve">5.4 Email Service</w:t>
       </w:r>
     </w:p>
     <w:tbl>
@@ -7519,7 +7317,7 @@
                 <w:sz w:val="20"/>
                 <w:szCs w:val="20"/>
               </w:rPr>
-              <w:t xml:space="preserve">MICROSOFT_CLIENT_ID</w:t>
+              <w:t xml:space="preserve">RESEND_API_KEY</w:t>
             </w:r>
           </w:p>
         </w:tc>
@@ -7538,7 +7336,7 @@
                 <w:sz w:val="20"/>
                 <w:szCs w:val="20"/>
               </w:rPr>
-              <w:t xml:space="preserve">Entra ID application client ID</w:t>
+              <w:t xml:space="preserve">Resend email service API key</w:t>
             </w:r>
           </w:p>
         </w:tc>
@@ -7557,7 +7355,7 @@
                 <w:sz w:val="20"/>
                 <w:szCs w:val="20"/>
               </w:rPr>
-              <w:t xml:space="preserve">From Azure Portal → App Registrations</w:t>
+              <w:t xml:space="preserve">From resend.com dashboard</w:t>
             </w:r>
           </w:p>
         </w:tc>
@@ -7575,39 +7373,39 @@
                 <w:sz w:val="20"/>
                 <w:szCs w:val="20"/>
               </w:rPr>
-              <w:t xml:space="preserve">MICROSOFT_CLIENT_SECRET</w:t>
-            </w:r>
-          </w:p>
-        </w:tc>
-        <w:tc>
-          <w:p>
-            <w:pPr>
-              <w:spacing w:after="40" w:before="40"/>
-            </w:pPr>
-            <w:r>
-              <w:rPr>
-                <w:rFonts w:ascii="Calibri" w:cs="Calibri" w:eastAsia="Calibri" w:hAnsi="Calibri"/>
-                <w:color w:val="333333"/>
-                <w:sz w:val="20"/>
-                <w:szCs w:val="20"/>
-              </w:rPr>
-              <w:t xml:space="preserve">Entra ID application client secret</w:t>
-            </w:r>
-          </w:p>
-        </w:tc>
-        <w:tc>
-          <w:p>
-            <w:pPr>
-              <w:spacing w:after="40" w:before="40"/>
-            </w:pPr>
-            <w:r>
-              <w:rPr>
-                <w:rFonts w:ascii="Calibri" w:cs="Calibri" w:eastAsia="Calibri" w:hAnsi="Calibri"/>
-                <w:color w:val="333333"/>
-                <w:sz w:val="20"/>
-                <w:szCs w:val="20"/>
-              </w:rPr>
-              <w:t xml:space="preserve">From Azure Portal → App Registrations</w:t>
+              <w:t xml:space="preserve">RESEND_FROM_EMAIL</w:t>
+            </w:r>
+          </w:p>
+        </w:tc>
+        <w:tc>
+          <w:p>
+            <w:pPr>
+              <w:spacing w:after="40" w:before="40"/>
+            </w:pPr>
+            <w:r>
+              <w:rPr>
+                <w:rFonts w:ascii="Calibri" w:cs="Calibri" w:eastAsia="Calibri" w:hAnsi="Calibri"/>
+                <w:color w:val="333333"/>
+                <w:sz w:val="20"/>
+                <w:szCs w:val="20"/>
+              </w:rPr>
+              <w:t xml:space="preserve">Sender email address</w:t>
+            </w:r>
+          </w:p>
+        </w:tc>
+        <w:tc>
+          <w:p>
+            <w:pPr>
+              <w:spacing w:after="40" w:before="40"/>
+            </w:pPr>
+            <w:r>
+              <w:rPr>
+                <w:rFonts w:ascii="Calibri" w:cs="Calibri" w:eastAsia="Calibri" w:hAnsi="Calibri"/>
+                <w:color w:val="333333"/>
+                <w:sz w:val="20"/>
+                <w:szCs w:val="20"/>
+              </w:rPr>
+              <w:t xml:space="preserve">noreply@fridayreport.ai</w:t>
             </w:r>
           </w:p>
         </w:tc>
@@ -7630,7 +7428,7 @@
           <w:bCs/>
           <w:color w:val="075DD1"/>
         </w:rPr>
-        <w:t xml:space="preserve">5.5 Email Service</w:t>
+        <w:t xml:space="preserve">5.5 Storage — Azure Blob</w:t>
       </w:r>
     </w:p>
     <w:tbl>
@@ -7731,7 +7529,7 @@
                 <w:sz w:val="20"/>
                 <w:szCs w:val="20"/>
               </w:rPr>
-              <w:t xml:space="preserve">RESEND_API_KEY</w:t>
+              <w:t xml:space="preserve">AZURE_STORAGE_ACCOUNT_NAME</w:t>
             </w:r>
           </w:p>
         </w:tc>
@@ -7750,7 +7548,7 @@
                 <w:sz w:val="20"/>
                 <w:szCs w:val="20"/>
               </w:rPr>
-              <w:t xml:space="preserve">Resend email service API key</w:t>
+              <w:t xml:space="preserve">Storage account name</w:t>
             </w:r>
           </w:p>
         </w:tc>
@@ -7769,7 +7567,7 @@
                 <w:sz w:val="20"/>
                 <w:szCs w:val="20"/>
               </w:rPr>
-              <w:t xml:space="preserve">From resend.com dashboard</w:t>
+              <w:t xml:space="preserve">fridayreportstorage</w:t>
             </w:r>
           </w:p>
         </w:tc>
@@ -7787,39 +7585,39 @@
                 <w:sz w:val="20"/>
                 <w:szCs w:val="20"/>
               </w:rPr>
-              <w:t xml:space="preserve">RESEND_FROM_EMAIL</w:t>
-            </w:r>
-          </w:p>
-        </w:tc>
-        <w:tc>
-          <w:p>
-            <w:pPr>
-              <w:spacing w:after="40" w:before="40"/>
-            </w:pPr>
-            <w:r>
-              <w:rPr>
-                <w:rFonts w:ascii="Calibri" w:cs="Calibri" w:eastAsia="Calibri" w:hAnsi="Calibri"/>
-                <w:color w:val="333333"/>
-                <w:sz w:val="20"/>
-                <w:szCs w:val="20"/>
-              </w:rPr>
-              <w:t xml:space="preserve">Sender email address</w:t>
-            </w:r>
-          </w:p>
-        </w:tc>
-        <w:tc>
-          <w:p>
-            <w:pPr>
-              <w:spacing w:after="40" w:before="40"/>
-            </w:pPr>
-            <w:r>
-              <w:rPr>
-                <w:rFonts w:ascii="Calibri" w:cs="Calibri" w:eastAsia="Calibri" w:hAnsi="Calibri"/>
-                <w:color w:val="333333"/>
-                <w:sz w:val="20"/>
-                <w:szCs w:val="20"/>
-              </w:rPr>
-              <w:t xml:space="preserve">noreply@fridayreport.ai</w:t>
+              <w:t xml:space="preserve">AZURE_STORAGE_CONTAINER_NAME</w:t>
+            </w:r>
+          </w:p>
+        </w:tc>
+        <w:tc>
+          <w:p>
+            <w:pPr>
+              <w:spacing w:after="40" w:before="40"/>
+            </w:pPr>
+            <w:r>
+              <w:rPr>
+                <w:rFonts w:ascii="Calibri" w:cs="Calibri" w:eastAsia="Calibri" w:hAnsi="Calibri"/>
+                <w:color w:val="333333"/>
+                <w:sz w:val="20"/>
+                <w:szCs w:val="20"/>
+              </w:rPr>
+              <w:t xml:space="preserve">Blob container for file uploads</w:t>
+            </w:r>
+          </w:p>
+        </w:tc>
+        <w:tc>
+          <w:p>
+            <w:pPr>
+              <w:spacing w:after="40" w:before="40"/>
+            </w:pPr>
+            <w:r>
+              <w:rPr>
+                <w:rFonts w:ascii="Calibri" w:cs="Calibri" w:eastAsia="Calibri" w:hAnsi="Calibri"/>
+                <w:color w:val="333333"/>
+                <w:sz w:val="20"/>
+                <w:szCs w:val="20"/>
+              </w:rPr>
+              <w:t xml:space="preserve">uploads</w:t>
             </w:r>
           </w:p>
         </w:tc>
@@ -7827,8 +7625,39 @@
     </w:tbl>
     <w:p>
       <w:pPr>
-        <w:spacing w:after="120" w:before="120"/>
-      </w:pPr>
+        <w:spacing w:after="80" w:before="80"/>
+      </w:pPr>
+      <w:r>
+        <w:rPr>
+          <w:rFonts w:ascii="Calibri" w:cs="Calibri" w:eastAsia="Calibri" w:hAnsi="Calibri"/>
+          <w:i/>
+          <w:iCs/>
+          <w:color w:val="333333"/>
+          <w:sz w:val="22"/>
+          <w:szCs w:val="22"/>
+        </w:rPr>
+        <w:t xml:space="preserve">When using Managed Identity, no connection string or access key is needed.</w:t>
+      </w:r>
+    </w:p>
+    <w:p>
+      <w:r>
+        <w:br w:type="page"/>
+      </w:r>
+    </w:p>
+    <w:p>
+      <w:pPr>
+        <w:pStyle w:val="Heading1"/>
+        <w:spacing w:after="180" w:before="360"/>
+      </w:pPr>
+      <w:r>
+        <w:rPr>
+          <w:rFonts w:ascii="Calibri" w:cs="Calibri" w:eastAsia="Calibri" w:hAnsi="Calibri"/>
+          <w:b/>
+          <w:bCs/>
+          <w:color w:val="17255A"/>
+        </w:rPr>
+        <w:t xml:space="preserve">6. Scaling &amp; Performance</w:t>
+      </w:r>
     </w:p>
     <w:p>
       <w:pPr>
@@ -7842,7 +7671,7 @@
           <w:bCs/>
           <w:color w:val="075DD1"/>
         </w:rPr>
-        <w:t xml:space="preserve">5.6 Payments — PayPal</w:t>
+        <w:t xml:space="preserve">6.1 Recommended Scaling Configuration</w:t>
       </w:r>
     </w:p>
     <w:tbl>
@@ -7880,461 +7709,6 @@
                 <w:sz w:val="20"/>
                 <w:szCs w:val="20"/>
               </w:rPr>
-              <w:t xml:space="preserve">Variable</w:t>
-            </w:r>
-          </w:p>
-        </w:tc>
-        <w:tc>
-          <w:tcPr>
-            <w:shd w:fill="17255A" w:color="17255A" w:val="solid"/>
-          </w:tcPr>
-          <w:p>
-            <w:pPr>
-              <w:spacing w:after="60" w:before="60"/>
-            </w:pPr>
-            <w:r>
-              <w:rPr>
-                <w:rFonts w:ascii="Calibri" w:cs="Calibri" w:eastAsia="Calibri" w:hAnsi="Calibri"/>
-                <w:b/>
-                <w:bCs/>
-                <w:color w:val="FFFFFF"/>
-                <w:sz w:val="20"/>
-                <w:szCs w:val="20"/>
-              </w:rPr>
-              <w:t xml:space="preserve">Description</w:t>
-            </w:r>
-          </w:p>
-        </w:tc>
-        <w:tc>
-          <w:tcPr>
-            <w:shd w:fill="17255A" w:color="17255A" w:val="solid"/>
-          </w:tcPr>
-          <w:p>
-            <w:pPr>
-              <w:spacing w:after="60" w:before="60"/>
-            </w:pPr>
-            <w:r>
-              <w:rPr>
-                <w:rFonts w:ascii="Calibri" w:cs="Calibri" w:eastAsia="Calibri" w:hAnsi="Calibri"/>
-                <w:b/>
-                <w:bCs/>
-                <w:color w:val="FFFFFF"/>
-                <w:sz w:val="20"/>
-                <w:szCs w:val="20"/>
-              </w:rPr>
-              <w:t xml:space="preserve">Example / Notes</w:t>
-            </w:r>
-          </w:p>
-        </w:tc>
-      </w:tr>
-      <w:tr>
-        <w:tc>
-          <w:tcPr>
-            <w:shd w:fill="F2F4F7" w:color="F2F4F7" w:val="solid"/>
-          </w:tcPr>
-          <w:p>
-            <w:pPr>
-              <w:spacing w:after="40" w:before="40"/>
-            </w:pPr>
-            <w:r>
-              <w:rPr>
-                <w:rFonts w:ascii="Calibri" w:cs="Calibri" w:eastAsia="Calibri" w:hAnsi="Calibri"/>
-                <w:color w:val="333333"/>
-                <w:sz w:val="20"/>
-                <w:szCs w:val="20"/>
-              </w:rPr>
-              <w:t xml:space="preserve">PAYPAL_CLIENT_ID</w:t>
-            </w:r>
-          </w:p>
-        </w:tc>
-        <w:tc>
-          <w:tcPr>
-            <w:shd w:fill="F2F4F7" w:color="F2F4F7" w:val="solid"/>
-          </w:tcPr>
-          <w:p>
-            <w:pPr>
-              <w:spacing w:after="40" w:before="40"/>
-            </w:pPr>
-            <w:r>
-              <w:rPr>
-                <w:rFonts w:ascii="Calibri" w:cs="Calibri" w:eastAsia="Calibri" w:hAnsi="Calibri"/>
-                <w:color w:val="333333"/>
-                <w:sz w:val="20"/>
-                <w:szCs w:val="20"/>
-              </w:rPr>
-              <w:t xml:space="preserve">PayPal REST API client ID</w:t>
-            </w:r>
-          </w:p>
-        </w:tc>
-        <w:tc>
-          <w:tcPr>
-            <w:shd w:fill="F2F4F7" w:color="F2F4F7" w:val="solid"/>
-          </w:tcPr>
-          <w:p>
-            <w:pPr>
-              <w:spacing w:after="40" w:before="40"/>
-            </w:pPr>
-            <w:r>
-              <w:rPr>
-                <w:rFonts w:ascii="Calibri" w:cs="Calibri" w:eastAsia="Calibri" w:hAnsi="Calibri"/>
-                <w:color w:val="333333"/>
-                <w:sz w:val="20"/>
-                <w:szCs w:val="20"/>
-              </w:rPr>
-              <w:t xml:space="preserve">From PayPal Developer Dashboard</w:t>
-            </w:r>
-          </w:p>
-        </w:tc>
-      </w:tr>
-      <w:tr>
-        <w:tc>
-          <w:p>
-            <w:pPr>
-              <w:spacing w:after="40" w:before="40"/>
-            </w:pPr>
-            <w:r>
-              <w:rPr>
-                <w:rFonts w:ascii="Calibri" w:cs="Calibri" w:eastAsia="Calibri" w:hAnsi="Calibri"/>
-                <w:color w:val="333333"/>
-                <w:sz w:val="20"/>
-                <w:szCs w:val="20"/>
-              </w:rPr>
-              <w:t xml:space="preserve">PAYPAL_CLIENT_SECRET</w:t>
-            </w:r>
-          </w:p>
-        </w:tc>
-        <w:tc>
-          <w:p>
-            <w:pPr>
-              <w:spacing w:after="40" w:before="40"/>
-            </w:pPr>
-            <w:r>
-              <w:rPr>
-                <w:rFonts w:ascii="Calibri" w:cs="Calibri" w:eastAsia="Calibri" w:hAnsi="Calibri"/>
-                <w:color w:val="333333"/>
-                <w:sz w:val="20"/>
-                <w:szCs w:val="20"/>
-              </w:rPr>
-              <w:t xml:space="preserve">PayPal REST API client secret</w:t>
-            </w:r>
-          </w:p>
-        </w:tc>
-        <w:tc>
-          <w:p>
-            <w:pPr>
-              <w:spacing w:after="40" w:before="40"/>
-            </w:pPr>
-            <w:r>
-              <w:rPr>
-                <w:rFonts w:ascii="Calibri" w:cs="Calibri" w:eastAsia="Calibri" w:hAnsi="Calibri"/>
-                <w:color w:val="333333"/>
-                <w:sz w:val="20"/>
-                <w:szCs w:val="20"/>
-              </w:rPr>
-              <w:t xml:space="preserve">From PayPal Developer Dashboard</w:t>
-            </w:r>
-          </w:p>
-        </w:tc>
-      </w:tr>
-    </w:tbl>
-    <w:p>
-      <w:pPr>
-        <w:spacing w:after="120" w:before="120"/>
-      </w:pPr>
-    </w:p>
-    <w:p>
-      <w:pPr>
-        <w:pStyle w:val="Heading2"/>
-        <w:spacing w:after="140" w:before="280"/>
-      </w:pPr>
-      <w:r>
-        <w:rPr>
-          <w:rFonts w:ascii="Calibri" w:cs="Calibri" w:eastAsia="Calibri" w:hAnsi="Calibri"/>
-          <w:b/>
-          <w:bCs/>
-          <w:color w:val="075DD1"/>
-        </w:rPr>
-        <w:t xml:space="preserve">5.7 Storage — Azure Blob</w:t>
-      </w:r>
-    </w:p>
-    <w:tbl>
-      <w:tblPr>
-        <w:tblW w:type="pct" w:w="100%"/>
-        <w:tblBorders>
-          <w:top w:val="single" w:color="CCCCCC" w:sz="1"/>
-          <w:left w:val="single" w:color="CCCCCC" w:sz="1"/>
-          <w:bottom w:val="single" w:color="CCCCCC" w:sz="1"/>
-          <w:right w:val="single" w:color="CCCCCC" w:sz="1"/>
-          <w:insideH w:val="single" w:color="CCCCCC" w:sz="1"/>
-          <w:insideV w:val="single" w:color="CCCCCC" w:sz="1"/>
-        </w:tblBorders>
-      </w:tblPr>
-      <w:tblGrid>
-        <w:gridCol w:w="100"/>
-        <w:gridCol w:w="100"/>
-        <w:gridCol w:w="100"/>
-      </w:tblGrid>
-      <w:tr>
-        <w:tc>
-          <w:tcPr>
-            <w:shd w:fill="17255A" w:color="17255A" w:val="solid"/>
-          </w:tcPr>
-          <w:p>
-            <w:pPr>
-              <w:spacing w:after="60" w:before="60"/>
-            </w:pPr>
-            <w:r>
-              <w:rPr>
-                <w:rFonts w:ascii="Calibri" w:cs="Calibri" w:eastAsia="Calibri" w:hAnsi="Calibri"/>
-                <w:b/>
-                <w:bCs/>
-                <w:color w:val="FFFFFF"/>
-                <w:sz w:val="20"/>
-                <w:szCs w:val="20"/>
-              </w:rPr>
-              <w:t xml:space="preserve">Variable</w:t>
-            </w:r>
-          </w:p>
-        </w:tc>
-        <w:tc>
-          <w:tcPr>
-            <w:shd w:fill="17255A" w:color="17255A" w:val="solid"/>
-          </w:tcPr>
-          <w:p>
-            <w:pPr>
-              <w:spacing w:after="60" w:before="60"/>
-            </w:pPr>
-            <w:r>
-              <w:rPr>
-                <w:rFonts w:ascii="Calibri" w:cs="Calibri" w:eastAsia="Calibri" w:hAnsi="Calibri"/>
-                <w:b/>
-                <w:bCs/>
-                <w:color w:val="FFFFFF"/>
-                <w:sz w:val="20"/>
-                <w:szCs w:val="20"/>
-              </w:rPr>
-              <w:t xml:space="preserve">Description</w:t>
-            </w:r>
-          </w:p>
-        </w:tc>
-        <w:tc>
-          <w:tcPr>
-            <w:shd w:fill="17255A" w:color="17255A" w:val="solid"/>
-          </w:tcPr>
-          <w:p>
-            <w:pPr>
-              <w:spacing w:after="60" w:before="60"/>
-            </w:pPr>
-            <w:r>
-              <w:rPr>
-                <w:rFonts w:ascii="Calibri" w:cs="Calibri" w:eastAsia="Calibri" w:hAnsi="Calibri"/>
-                <w:b/>
-                <w:bCs/>
-                <w:color w:val="FFFFFF"/>
-                <w:sz w:val="20"/>
-                <w:szCs w:val="20"/>
-              </w:rPr>
-              <w:t xml:space="preserve">Example / Notes</w:t>
-            </w:r>
-          </w:p>
-        </w:tc>
-      </w:tr>
-      <w:tr>
-        <w:tc>
-          <w:tcPr>
-            <w:shd w:fill="F2F4F7" w:color="F2F4F7" w:val="solid"/>
-          </w:tcPr>
-          <w:p>
-            <w:pPr>
-              <w:spacing w:after="40" w:before="40"/>
-            </w:pPr>
-            <w:r>
-              <w:rPr>
-                <w:rFonts w:ascii="Calibri" w:cs="Calibri" w:eastAsia="Calibri" w:hAnsi="Calibri"/>
-                <w:color w:val="333333"/>
-                <w:sz w:val="20"/>
-                <w:szCs w:val="20"/>
-              </w:rPr>
-              <w:t xml:space="preserve">AZURE_STORAGE_ACCOUNT_NAME</w:t>
-            </w:r>
-          </w:p>
-        </w:tc>
-        <w:tc>
-          <w:tcPr>
-            <w:shd w:fill="F2F4F7" w:color="F2F4F7" w:val="solid"/>
-          </w:tcPr>
-          <w:p>
-            <w:pPr>
-              <w:spacing w:after="40" w:before="40"/>
-            </w:pPr>
-            <w:r>
-              <w:rPr>
-                <w:rFonts w:ascii="Calibri" w:cs="Calibri" w:eastAsia="Calibri" w:hAnsi="Calibri"/>
-                <w:color w:val="333333"/>
-                <w:sz w:val="20"/>
-                <w:szCs w:val="20"/>
-              </w:rPr>
-              <w:t xml:space="preserve">Storage account name</w:t>
-            </w:r>
-          </w:p>
-        </w:tc>
-        <w:tc>
-          <w:tcPr>
-            <w:shd w:fill="F2F4F7" w:color="F2F4F7" w:val="solid"/>
-          </w:tcPr>
-          <w:p>
-            <w:pPr>
-              <w:spacing w:after="40" w:before="40"/>
-            </w:pPr>
-            <w:r>
-              <w:rPr>
-                <w:rFonts w:ascii="Calibri" w:cs="Calibri" w:eastAsia="Calibri" w:hAnsi="Calibri"/>
-                <w:color w:val="333333"/>
-                <w:sz w:val="20"/>
-                <w:szCs w:val="20"/>
-              </w:rPr>
-              <w:t xml:space="preserve">fridayreportstorage</w:t>
-            </w:r>
-          </w:p>
-        </w:tc>
-      </w:tr>
-      <w:tr>
-        <w:tc>
-          <w:p>
-            <w:pPr>
-              <w:spacing w:after="40" w:before="40"/>
-            </w:pPr>
-            <w:r>
-              <w:rPr>
-                <w:rFonts w:ascii="Calibri" w:cs="Calibri" w:eastAsia="Calibri" w:hAnsi="Calibri"/>
-                <w:color w:val="333333"/>
-                <w:sz w:val="20"/>
-                <w:szCs w:val="20"/>
-              </w:rPr>
-              <w:t xml:space="preserve">AZURE_STORAGE_CONTAINER_NAME</w:t>
-            </w:r>
-          </w:p>
-        </w:tc>
-        <w:tc>
-          <w:p>
-            <w:pPr>
-              <w:spacing w:after="40" w:before="40"/>
-            </w:pPr>
-            <w:r>
-              <w:rPr>
-                <w:rFonts w:ascii="Calibri" w:cs="Calibri" w:eastAsia="Calibri" w:hAnsi="Calibri"/>
-                <w:color w:val="333333"/>
-                <w:sz w:val="20"/>
-                <w:szCs w:val="20"/>
-              </w:rPr>
-              <w:t xml:space="preserve">Blob container for file uploads</w:t>
-            </w:r>
-          </w:p>
-        </w:tc>
-        <w:tc>
-          <w:p>
-            <w:pPr>
-              <w:spacing w:after="40" w:before="40"/>
-            </w:pPr>
-            <w:r>
-              <w:rPr>
-                <w:rFonts w:ascii="Calibri" w:cs="Calibri" w:eastAsia="Calibri" w:hAnsi="Calibri"/>
-                <w:color w:val="333333"/>
-                <w:sz w:val="20"/>
-                <w:szCs w:val="20"/>
-              </w:rPr>
-              <w:t xml:space="preserve">uploads</w:t>
-            </w:r>
-          </w:p>
-        </w:tc>
-      </w:tr>
-    </w:tbl>
-    <w:p>
-      <w:pPr>
-        <w:spacing w:after="80" w:before="80"/>
-      </w:pPr>
-      <w:r>
-        <w:rPr>
-          <w:rFonts w:ascii="Calibri" w:cs="Calibri" w:eastAsia="Calibri" w:hAnsi="Calibri"/>
-          <w:i/>
-          <w:iCs/>
-          <w:color w:val="333333"/>
-          <w:sz w:val="22"/>
-          <w:szCs w:val="22"/>
-        </w:rPr>
-        <w:t xml:space="preserve">When using Managed Identity, no connection string or access key is needed.</w:t>
-      </w:r>
-    </w:p>
-    <w:p>
-      <w:r>
-        <w:br w:type="page"/>
-      </w:r>
-    </w:p>
-    <w:p>
-      <w:pPr>
-        <w:pStyle w:val="Heading1"/>
-        <w:spacing w:after="180" w:before="360"/>
-      </w:pPr>
-      <w:r>
-        <w:rPr>
-          <w:rFonts w:ascii="Calibri" w:cs="Calibri" w:eastAsia="Calibri" w:hAnsi="Calibri"/>
-          <w:b/>
-          <w:bCs/>
-          <w:color w:val="17255A"/>
-        </w:rPr>
-        <w:t xml:space="preserve">6. Scaling &amp; Performance</w:t>
-      </w:r>
-    </w:p>
-    <w:p>
-      <w:pPr>
-        <w:pStyle w:val="Heading2"/>
-        <w:spacing w:after="140" w:before="280"/>
-      </w:pPr>
-      <w:r>
-        <w:rPr>
-          <w:rFonts w:ascii="Calibri" w:cs="Calibri" w:eastAsia="Calibri" w:hAnsi="Calibri"/>
-          <w:b/>
-          <w:bCs/>
-          <w:color w:val="075DD1"/>
-        </w:rPr>
-        <w:t xml:space="preserve">6.1 Recommended Scaling Configuration</w:t>
-      </w:r>
-    </w:p>
-    <w:tbl>
-      <w:tblPr>
-        <w:tblW w:type="pct" w:w="100%"/>
-        <w:tblBorders>
-          <w:top w:val="single" w:color="CCCCCC" w:sz="1"/>
-          <w:left w:val="single" w:color="CCCCCC" w:sz="1"/>
-          <w:bottom w:val="single" w:color="CCCCCC" w:sz="1"/>
-          <w:right w:val="single" w:color="CCCCCC" w:sz="1"/>
-          <w:insideH w:val="single" w:color="CCCCCC" w:sz="1"/>
-          <w:insideV w:val="single" w:color="CCCCCC" w:sz="1"/>
-        </w:tblBorders>
-      </w:tblPr>
-      <w:tblGrid>
-        <w:gridCol w:w="100"/>
-        <w:gridCol w:w="100"/>
-        <w:gridCol w:w="100"/>
-      </w:tblGrid>
-      <w:tr>
-        <w:tc>
-          <w:tcPr>
-            <w:shd w:fill="17255A" w:color="17255A" w:val="solid"/>
-          </w:tcPr>
-          <w:p>
-            <w:pPr>
-              <w:spacing w:after="60" w:before="60"/>
-            </w:pPr>
-            <w:r>
-              <w:rPr>
-                <w:rFonts w:ascii="Calibri" w:cs="Calibri" w:eastAsia="Calibri" w:hAnsi="Calibri"/>
-                <w:b/>
-                <w:bCs/>
-                <w:color w:val="FFFFFF"/>
-                <w:sz w:val="20"/>
-                <w:szCs w:val="20"/>
-              </w:rPr>
               <w:t xml:space="preserve">Parameter</w:t>
             </w:r>
           </w:p>
@@ -10071,7 +9445,7 @@
           <w:sz w:val="22"/>
           <w:szCs w:val="22"/>
         </w:rPr>
-        <w:t xml:space="preserve">5. AI Services: OpenAI vs. Azure OpenAI</w:t>
+        <w:t xml:space="preserve">5. Custom Domain &amp; DNS</w:t>
       </w:r>
     </w:p>
     <w:p>
@@ -10085,7 +9459,7 @@
           <w:sz w:val="22"/>
           <w:szCs w:val="22"/>
         </w:rPr>
-        <w:t xml:space="preserve">The application uses OpenAI directly. Consider Azure OpenAI Service for data residency, compliance, and integrated billing. The OpenAI SDK supports Azure OpenAI endpoints with minimal code changes (update base URL and API key).</w:t>
+        <w:t xml:space="preserve">Azure Container Apps supports custom domains with managed TLS certificates. Plan DNS configuration including CNAME records and domain verification.</w:t>
       </w:r>
     </w:p>
     <w:p>
@@ -10101,37 +9475,7 @@
           <w:sz w:val="22"/>
           <w:szCs w:val="22"/>
         </w:rPr>
-        <w:t xml:space="preserve">6. Custom Domain &amp; DNS</w:t>
-      </w:r>
-    </w:p>
-    <w:p>
-      <w:pPr>
-        <w:spacing w:after="80" w:before="80"/>
-      </w:pPr>
-      <w:r>
-        <w:rPr>
-          <w:rFonts w:ascii="Calibri" w:cs="Calibri" w:eastAsia="Calibri" w:hAnsi="Calibri"/>
-          <w:color w:val="333333"/>
-          <w:sz w:val="22"/>
-          <w:szCs w:val="22"/>
-        </w:rPr>
-        <w:t xml:space="preserve">Azure Container Apps supports custom domains with managed TLS certificates. Plan DNS configuration including CNAME records and domain verification.</w:t>
-      </w:r>
-    </w:p>
-    <w:p>
-      <w:pPr>
-        <w:spacing w:after="60" w:before="140"/>
-      </w:pPr>
-      <w:r>
-        <w:rPr>
-          <w:rFonts w:ascii="Calibri" w:cs="Calibri" w:eastAsia="Calibri" w:hAnsi="Calibri"/>
-          <w:b/>
-          <w:bCs/>
-          <w:color w:val="333333"/>
-          <w:sz w:val="22"/>
-          <w:szCs w:val="22"/>
-        </w:rPr>
-        <w:t xml:space="preserve">7. Session Management</w:t>
+        <w:t xml:space="preserve">6. Session Management</w:t>
       </w:r>
     </w:p>
     <w:p>

</xml_diff>